<commit_message>
Fix department name to Information System
Co-Authored-By: Claude Sonnet 5.5 <noreply@anthropic.com>
Claude-Session: https://claude.ai/code/session_01SSddyk4xchbKHwDTwjoLhd
</commit_message>
<xml_diff>
--- a/Poisson-SNS_IEEE_Access_manuscript.docx
+++ b/Poisson-SNS_IEEE_Access_manuscript.docx
@@ -125,7 +125,7 @@
           <w:i/>
           <w:sz w:val="18"/>
         </w:rPr>
-        <w:t>Department of Information Systems, Hanyang University, Seoul, Korea</w:t>
+        <w:t>Department of Information System, Hanyang University, Seoul, Korea</w:t>
       </w:r>
     </w:p>
     <w:p>
@@ -14395,7 +14395,7 @@
         <w:rPr>
           <w:sz w:val="16"/>
         </w:rPr>
-        <w:t>is a professor in the Department of Information Systems at Hanyang University, Seoul, Korea. He received the Ph.D. degree in management of information systems from Claremont Graduate University, USA. He was a faculty member at the University of Queensland, Australia, the University of Nevada at Las Vegas, USA, and North Carolina A&amp;T State University, USA. His research interests include information systems economics, information systems maintenance, large language models, and critical social theory.</w:t>
+        <w:t>is a professor in the Department of Information System at Hanyang University, Seoul, Korea. He received the Ph.D. degree in management of information systems from Claremont Graduate University, USA. He was a faculty member at the University of Queensland, Australia, the University of Nevada at Las Vegas, USA, and North Carolina A&amp;T State University, USA. His research interests include information systems economics, information systems maintenance, large language models, and critical social theory.</w:t>
       </w:r>
     </w:p>
     <w:sectPr>

</xml_diff>